<commit_message>
refactor: reorganise en architecture modulaire (core/, models/, utils/, api/)
</commit_message>
<xml_diff>
--- a/docs/Boeuf_Tracker_Evolution_Technique.docx
+++ b/docs/Boeuf_Tracker_Evolution_Technique.docx
@@ -313,7 +313,7 @@
                 <w:sz w:val="20"/>
                 <w:szCs w:val="20"/>
               </w:rPr>
-              <w:t xml:space="preserve">Ismael Gansonre</w:t>
+              <w:t xml:space="preserve"/>
             </w:r>
           </w:p>
         </w:tc>
@@ -746,15 +746,7 @@
           <w:sz w:val="22"/>
           <w:szCs w:val="22"/>
         </w:rPr>
-        <w:t xml:space="preserve">11.  </w:t>
-      </w:r>
-      <w:r>
-        <w:rPr>
-          <w:rFonts w:ascii="Calibri" w:cs="Calibri" w:eastAsia="Calibri" w:hAnsi="Calibri"/>
-          <w:sz w:val="22"/>
-          <w:szCs w:val="22"/>
-        </w:rPr>
-        <w:t xml:space="preserve">Tableau récapitulatif des décisions</w:t>
+        <w:t>11.  Étape 9 — Posture couchée et rappel de détection en troupeau</w:t>
       </w:r>
     </w:p>
     <w:p>
@@ -770,15 +762,7 @@
           <w:sz w:val="22"/>
           <w:szCs w:val="22"/>
         </w:rPr>
-        <w:t xml:space="preserve">12.  </w:t>
-      </w:r>
-      <w:r>
-        <w:rPr>
-          <w:rFonts w:ascii="Calibri" w:cs="Calibri" w:eastAsia="Calibri" w:hAnsi="Calibri"/>
-          <w:sz w:val="22"/>
-          <w:szCs w:val="22"/>
-        </w:rPr>
-        <w:t xml:space="preserve">Limites connues et honnêteté scientifique</w:t>
+        <w:t>12.  Étape 10 — Vidéos de terrain au smartphone : comptage et comportements fiabilisés</w:t>
       </w:r>
     </w:p>
     <w:p>
@@ -794,15 +778,60 @@
           <w:sz w:val="22"/>
           <w:szCs w:val="22"/>
         </w:rPr>
-        <w:t xml:space="preserve">13.  </w:t>
-      </w:r>
-      <w:r>
-        <w:rPr>
-          <w:rFonts w:ascii="Calibri" w:cs="Calibri" w:eastAsia="Calibri" w:hAnsi="Calibri"/>
-          <w:sz w:val="22"/>
-          <w:szCs w:val="22"/>
-        </w:rPr>
-        <w:t xml:space="preserve">Perspectives</w:t>
+        <w:t>13.  Tableau récapitulatif des décisions</w:t>
+      </w:r>
+      <w:r>
+        <w:rPr>
+          <w:rFonts w:ascii="Calibri" w:cs="Calibri" w:eastAsia="Calibri" w:hAnsi="Calibri"/>
+          <w:sz w:val="22"/>
+          <w:szCs w:val="22"/>
+        </w:rPr>
+      </w:r>
+    </w:p>
+    <w:p>
+      <w:pPr>
+        <w:spacing w:after="90" w:before="0" w:line="276"/>
+      </w:pPr>
+      <w:r>
+        <w:rPr>
+          <w:rFonts w:ascii="Calibri" w:cs="Calibri" w:eastAsia="Calibri" w:hAnsi="Calibri"/>
+          <w:b/>
+          <w:bCs/>
+          <w:color w:val="2E74B5"/>
+          <w:sz w:val="22"/>
+          <w:szCs w:val="22"/>
+        </w:rPr>
+        <w:t>14.  Limites connues et honnêteté scientifique</w:t>
+      </w:r>
+      <w:r>
+        <w:rPr>
+          <w:rFonts w:ascii="Calibri" w:cs="Calibri" w:eastAsia="Calibri" w:hAnsi="Calibri"/>
+          <w:sz w:val="22"/>
+          <w:szCs w:val="22"/>
+        </w:rPr>
+      </w:r>
+    </w:p>
+    <w:p>
+      <w:pPr>
+        <w:spacing w:after="90" w:before="0" w:line="276"/>
+      </w:pPr>
+      <w:r>
+        <w:rPr>
+          <w:rFonts w:ascii="Calibri" w:cs="Calibri" w:eastAsia="Calibri" w:hAnsi="Calibri"/>
+          <w:b/>
+          <w:bCs/>
+          <w:color w:val="2E74B5"/>
+          <w:sz w:val="22"/>
+          <w:szCs w:val="22"/>
+        </w:rPr>
+        <w:t>15.  Perspectives</w:t>
+      </w:r>
+      <w:r>
+        <w:rPr>
+          <w:rFonts w:ascii="Calibri" w:cs="Calibri" w:eastAsia="Calibri" w:hAnsi="Calibri"/>
+          <w:sz w:val="22"/>
+          <w:szCs w:val="22"/>
+        </w:rPr>
       </w:r>
     </w:p>
     <w:p>
@@ -1527,130 +1556,46 @@
         <w:t xml:space="preserve"/>
       </w:r>
     </w:p>
-    <w:tbl>
-      <w:tblPr>
-        <w:tblW w:type="dxa" w:w="9360"/>
-        <w:tblBorders>
-          <w:top w:val="dashed" w:color="2E74B5" w:sz="8"/>
-          <w:left w:val="dashed" w:color="2E74B5" w:sz="8"/>
-          <w:bottom w:val="dashed" w:color="2E74B5" w:sz="8"/>
-          <w:right w:val="dashed" w:color="2E74B5" w:sz="8"/>
-          <w:insideH w:val="single" w:color="auto" w:sz="4"/>
-          <w:insideV w:val="single" w:color="auto" w:sz="4"/>
-        </w:tblBorders>
-      </w:tblPr>
-      <w:tblGrid>
-        <w:gridCol w:w="9360"/>
-      </w:tblGrid>
-      <w:tr>
-        <w:tc>
-          <w:tcPr>
-            <w:tcW w:type="dxa" w:w="9360"/>
-            <w:shd w:fill="FAFCFF" w:color="auto" w:val="clear"/>
-            <w:tcMar>
-              <w:top w:type="dxa" w:w="240"/>
-              <w:left w:type="dxa" w:w="200"/>
-              <w:bottom w:type="dxa" w:w="240"/>
-              <w:right w:type="dxa" w:w="200"/>
-            </w:tcMar>
-          </w:tcPr>
-          <w:p>
-            <w:pPr>
-              <w:spacing w:after="0"/>
-            </w:pPr>
-            <w:r>
-              <w:rPr>
-                <w:sz w:val="18"/>
-                <w:szCs w:val="18"/>
-              </w:rPr>
-              <w:t xml:space="preserve"/>
-            </w:r>
-          </w:p>
-          <w:p>
-            <w:pPr>
-              <w:spacing w:after="0"/>
-            </w:pPr>
-            <w:r>
-              <w:rPr>
-                <w:sz w:val="18"/>
-                <w:szCs w:val="18"/>
-              </w:rPr>
-              <w:t xml:space="preserve"/>
-            </w:r>
-          </w:p>
-          <w:p>
-            <w:pPr>
-              <w:spacing w:after="100" w:before="0" w:line="276"/>
-              <w:jc w:val="center"/>
-            </w:pPr>
-            <w:r>
-              <w:rPr>
-                <w:rFonts w:ascii="Calibri" w:cs="Calibri" w:eastAsia="Calibri" w:hAnsi="Calibri"/>
-                <w:b/>
-                <w:bCs/>
-                <w:color w:val="2E74B5"/>
-                <w:sz w:val="20"/>
-                <w:szCs w:val="20"/>
-              </w:rPr>
-              <w:t xml:space="preserve">[ ESPACE RÉSERVÉ — INSÉRER LA CAPTURE D'ÉCRAN ICI ]</w:t>
-            </w:r>
-          </w:p>
-          <w:p>
-            <w:pPr>
-              <w:spacing w:after="0" w:before="0" w:line="276"/>
-              <w:jc w:val="center"/>
-            </w:pPr>
-            <w:r>
-              <w:rPr>
-                <w:rFonts w:ascii="Calibri" w:cs="Calibri" w:eastAsia="Calibri" w:hAnsi="Calibri"/>
-                <w:i/>
-                <w:iCs/>
-                <w:color w:val="808080"/>
-                <w:sz w:val="18"/>
-                <w:szCs w:val="18"/>
-              </w:rPr>
-              <w:t xml:space="preserve">Suggestion : capture de l'interface complète avec plusieurs bovins détectés, noms et comportements affichés.</w:t>
-            </w:r>
-          </w:p>
-          <w:p>
-            <w:pPr>
-              <w:spacing w:after="0"/>
-            </w:pPr>
-            <w:r>
-              <w:rPr>
-                <w:sz w:val="18"/>
-                <w:szCs w:val="18"/>
-              </w:rPr>
-              <w:t xml:space="preserve"/>
-            </w:r>
-          </w:p>
-          <w:p>
-            <w:pPr>
-              <w:spacing w:after="0"/>
-            </w:pPr>
-            <w:r>
-              <w:rPr>
-                <w:sz w:val="18"/>
-                <w:szCs w:val="18"/>
-              </w:rPr>
-              <w:t xml:space="preserve"/>
-            </w:r>
-          </w:p>
-          <w:p>
-            <w:pPr>
-              <w:spacing w:after="0"/>
-            </w:pPr>
-            <w:r>
-              <w:rPr>
-                <w:sz w:val="18"/>
-                <w:szCs w:val="18"/>
-              </w:rPr>
-              <w:t xml:space="preserve"/>
-            </w:r>
-          </w:p>
-        </w:tc>
-      </w:tr>
-    </w:tbl>
+    <w:p>
+      <w:pPr>
+        <w:spacing w:after="120"/>
+        <w:jc w:val="center"/>
+      </w:pPr>
+      <w:r>
+        <w:drawing>
+          <wp:inline xmlns:a="http://schemas.openxmlformats.org/drawingml/2006/main" xmlns:pic="http://schemas.openxmlformats.org/drawingml/2006/picture">
+            <wp:extent cx="5669280" cy="3186480"/>
+            <wp:docPr id="107" name="capture_interface.jpg"/>
+            <wp:cNvGraphicFramePr>
+              <a:graphicFrameLocks noChangeAspect="1"/>
+            </wp:cNvGraphicFramePr>
+            <a:graphic>
+              <a:graphicData uri="http://schemas.openxmlformats.org/drawingml/2006/picture">
+                <pic:pic>
+                  <pic:nvPicPr>
+                    <pic:cNvPr id="0" name="capture_interface.jpg"/>
+                    <pic:cNvPicPr/>
+                  </pic:nvPicPr>
+                  <pic:blipFill>
+                    <a:blip r:embed="rIdImg7"/>
+                    <a:stretch>
+                      <a:fillRect/>
+                    </a:stretch>
+                  </pic:blipFill>
+                  <pic:spPr>
+                    <a:xfrm>
+                      <a:off x="0" y="0"/>
+                      <a:ext cx="5669280" cy="3186480"/>
+                    </a:xfrm>
+                    <a:prstGeom prst="rect"/>
+                  </pic:spPr>
+                </pic:pic>
+              </a:graphicData>
+            </a:graphic>
+          </wp:inline>
+        </w:drawing>
+      </w:r>
+    </w:p>
     <w:p>
       <w:pPr>
         <w:spacing w:after="220" w:before="80" w:line="276"/>
@@ -2340,130 +2285,46 @@
         <w:t xml:space="preserve"/>
       </w:r>
     </w:p>
-    <w:tbl>
-      <w:tblPr>
-        <w:tblW w:type="dxa" w:w="9360"/>
-        <w:tblBorders>
-          <w:top w:val="dashed" w:color="2E74B5" w:sz="8"/>
-          <w:left w:val="dashed" w:color="2E74B5" w:sz="8"/>
-          <w:bottom w:val="dashed" w:color="2E74B5" w:sz="8"/>
-          <w:right w:val="dashed" w:color="2E74B5" w:sz="8"/>
-          <w:insideH w:val="single" w:color="auto" w:sz="4"/>
-          <w:insideV w:val="single" w:color="auto" w:sz="4"/>
-        </w:tblBorders>
-      </w:tblPr>
-      <w:tblGrid>
-        <w:gridCol w:w="9360"/>
-      </w:tblGrid>
-      <w:tr>
-        <w:tc>
-          <w:tcPr>
-            <w:tcW w:type="dxa" w:w="9360"/>
-            <w:shd w:fill="FAFCFF" w:color="auto" w:val="clear"/>
-            <w:tcMar>
-              <w:top w:type="dxa" w:w="240"/>
-              <w:left w:type="dxa" w:w="200"/>
-              <w:bottom w:type="dxa" w:w="240"/>
-              <w:right w:type="dxa" w:w="200"/>
-            </w:tcMar>
-          </w:tcPr>
-          <w:p>
-            <w:pPr>
-              <w:spacing w:after="0"/>
-            </w:pPr>
-            <w:r>
-              <w:rPr>
-                <w:sz w:val="18"/>
-                <w:szCs w:val="18"/>
-              </w:rPr>
-              <w:t xml:space="preserve"/>
-            </w:r>
-          </w:p>
-          <w:p>
-            <w:pPr>
-              <w:spacing w:after="0"/>
-            </w:pPr>
-            <w:r>
-              <w:rPr>
-                <w:sz w:val="18"/>
-                <w:szCs w:val="18"/>
-              </w:rPr>
-              <w:t xml:space="preserve"/>
-            </w:r>
-          </w:p>
-          <w:p>
-            <w:pPr>
-              <w:spacing w:after="100" w:before="0" w:line="276"/>
-              <w:jc w:val="center"/>
-            </w:pPr>
-            <w:r>
-              <w:rPr>
-                <w:rFonts w:ascii="Calibri" w:cs="Calibri" w:eastAsia="Calibri" w:hAnsi="Calibri"/>
-                <w:b/>
-                <w:bCs/>
-                <w:color w:val="2E74B5"/>
-                <w:sz w:val="20"/>
-                <w:szCs w:val="20"/>
-              </w:rPr>
-              <w:t xml:space="preserve">[ ESPACE RÉSERVÉ — INSÉRER LA CAPTURE D'ÉCRAN ICI ]</w:t>
-            </w:r>
-          </w:p>
-          <w:p>
-            <w:pPr>
-              <w:spacing w:after="0" w:before="0" w:line="276"/>
-              <w:jc w:val="center"/>
-            </w:pPr>
-            <w:r>
-              <w:rPr>
-                <w:rFonts w:ascii="Calibri" w:cs="Calibri" w:eastAsia="Calibri" w:hAnsi="Calibri"/>
-                <w:i/>
-                <w:iCs/>
-                <w:color w:val="808080"/>
-                <w:sz w:val="18"/>
-                <w:szCs w:val="18"/>
-              </w:rPr>
-              <w:t xml:space="preserve">Suggestion : capture montrant les boîtes englobantes et le compteur d'images par seconde.</w:t>
-            </w:r>
-          </w:p>
-          <w:p>
-            <w:pPr>
-              <w:spacing w:after="0"/>
-            </w:pPr>
-            <w:r>
-              <w:rPr>
-                <w:sz w:val="18"/>
-                <w:szCs w:val="18"/>
-              </w:rPr>
-              <w:t xml:space="preserve"/>
-            </w:r>
-          </w:p>
-          <w:p>
-            <w:pPr>
-              <w:spacing w:after="0"/>
-            </w:pPr>
-            <w:r>
-              <w:rPr>
-                <w:sz w:val="18"/>
-                <w:szCs w:val="18"/>
-              </w:rPr>
-              <w:t xml:space="preserve"/>
-            </w:r>
-          </w:p>
-          <w:p>
-            <w:pPr>
-              <w:spacing w:after="0"/>
-            </w:pPr>
-            <w:r>
-              <w:rPr>
-                <w:sz w:val="18"/>
-                <w:szCs w:val="18"/>
-              </w:rPr>
-              <w:t xml:space="preserve"/>
-            </w:r>
-          </w:p>
-        </w:tc>
-      </w:tr>
-    </w:tbl>
+    <w:p>
+      <w:pPr>
+        <w:spacing w:after="120"/>
+        <w:jc w:val="center"/>
+      </w:pPr>
+      <w:r>
+        <w:drawing>
+          <wp:inline xmlns:a="http://schemas.openxmlformats.org/drawingml/2006/main" xmlns:pic="http://schemas.openxmlformats.org/drawingml/2006/picture">
+            <wp:extent cx="5669280" cy="3186480"/>
+            <wp:docPr id="108" name="capture_detection.jpg"/>
+            <wp:cNvGraphicFramePr>
+              <a:graphicFrameLocks noChangeAspect="1"/>
+            </wp:cNvGraphicFramePr>
+            <a:graphic>
+              <a:graphicData uri="http://schemas.openxmlformats.org/drawingml/2006/picture">
+                <pic:pic>
+                  <pic:nvPicPr>
+                    <pic:cNvPr id="0" name="capture_detection.jpg"/>
+                    <pic:cNvPicPr/>
+                  </pic:nvPicPr>
+                  <pic:blipFill>
+                    <a:blip r:embed="rIdImg8"/>
+                    <a:stretch>
+                      <a:fillRect/>
+                    </a:stretch>
+                  </pic:blipFill>
+                  <pic:spPr>
+                    <a:xfrm>
+                      <a:off x="0" y="0"/>
+                      <a:ext cx="5669280" cy="3186480"/>
+                    </a:xfrm>
+                    <a:prstGeom prst="rect"/>
+                  </pic:spPr>
+                </pic:pic>
+              </a:graphicData>
+            </a:graphic>
+          </wp:inline>
+        </w:drawing>
+      </w:r>
+    </w:p>
     <w:p>
       <w:pPr>
         <w:spacing w:after="220" w:before="80" w:line="276"/>
@@ -2699,130 +2560,46 @@
         <w:t xml:space="preserve"/>
       </w:r>
     </w:p>
-    <w:tbl>
-      <w:tblPr>
-        <w:tblW w:type="dxa" w:w="9360"/>
-        <w:tblBorders>
-          <w:top w:val="dashed" w:color="2E74B5" w:sz="8"/>
-          <w:left w:val="dashed" w:color="2E74B5" w:sz="8"/>
-          <w:bottom w:val="dashed" w:color="2E74B5" w:sz="8"/>
-          <w:right w:val="dashed" w:color="2E74B5" w:sz="8"/>
-          <w:insideH w:val="single" w:color="auto" w:sz="4"/>
-          <w:insideV w:val="single" w:color="auto" w:sz="4"/>
-        </w:tblBorders>
-      </w:tblPr>
-      <w:tblGrid>
-        <w:gridCol w:w="9360"/>
-      </w:tblGrid>
-      <w:tr>
-        <w:tc>
-          <w:tcPr>
-            <w:tcW w:type="dxa" w:w="9360"/>
-            <w:shd w:fill="FAFCFF" w:color="auto" w:val="clear"/>
-            <w:tcMar>
-              <w:top w:type="dxa" w:w="240"/>
-              <w:left w:type="dxa" w:w="200"/>
-              <w:bottom w:type="dxa" w:w="240"/>
-              <w:right w:type="dxa" w:w="200"/>
-            </w:tcMar>
-          </w:tcPr>
-          <w:p>
-            <w:pPr>
-              <w:spacing w:after="0"/>
-            </w:pPr>
-            <w:r>
-              <w:rPr>
-                <w:sz w:val="18"/>
-                <w:szCs w:val="18"/>
-              </w:rPr>
-              <w:t xml:space="preserve"/>
-            </w:r>
-          </w:p>
-          <w:p>
-            <w:pPr>
-              <w:spacing w:after="0"/>
-            </w:pPr>
-            <w:r>
-              <w:rPr>
-                <w:sz w:val="18"/>
-                <w:szCs w:val="18"/>
-              </w:rPr>
-              <w:t xml:space="preserve"/>
-            </w:r>
-          </w:p>
-          <w:p>
-            <w:pPr>
-              <w:spacing w:after="100" w:before="0" w:line="276"/>
-              <w:jc w:val="center"/>
-            </w:pPr>
-            <w:r>
-              <w:rPr>
-                <w:rFonts w:ascii="Calibri" w:cs="Calibri" w:eastAsia="Calibri" w:hAnsi="Calibri"/>
-                <w:b/>
-                <w:bCs/>
-                <w:color w:val="2E74B5"/>
-                <w:sz w:val="20"/>
-                <w:szCs w:val="20"/>
-              </w:rPr>
-              <w:t xml:space="preserve">[ ESPACE RÉSERVÉ — INSÉRER LA CAPTURE D'ÉCRAN ICI ]</w:t>
-            </w:r>
-          </w:p>
-          <w:p>
-            <w:pPr>
-              <w:spacing w:after="0" w:before="0" w:line="276"/>
-              <w:jc w:val="center"/>
-            </w:pPr>
-            <w:r>
-              <w:rPr>
-                <w:rFonts w:ascii="Calibri" w:cs="Calibri" w:eastAsia="Calibri" w:hAnsi="Calibri"/>
-                <w:i/>
-                <w:iCs/>
-                <w:color w:val="808080"/>
-                <w:sz w:val="18"/>
-                <w:szCs w:val="18"/>
-              </w:rPr>
-              <w:t xml:space="preserve">Suggestion : deux captures côte à côte, ou une capture montrant les contours précis des silhouettes.</w:t>
-            </w:r>
-          </w:p>
-          <w:p>
-            <w:pPr>
-              <w:spacing w:after="0"/>
-            </w:pPr>
-            <w:r>
-              <w:rPr>
-                <w:sz w:val="18"/>
-                <w:szCs w:val="18"/>
-              </w:rPr>
-              <w:t xml:space="preserve"/>
-            </w:r>
-          </w:p>
-          <w:p>
-            <w:pPr>
-              <w:spacing w:after="0"/>
-            </w:pPr>
-            <w:r>
-              <w:rPr>
-                <w:sz w:val="18"/>
-                <w:szCs w:val="18"/>
-              </w:rPr>
-              <w:t xml:space="preserve"/>
-            </w:r>
-          </w:p>
-          <w:p>
-            <w:pPr>
-              <w:spacing w:after="0"/>
-            </w:pPr>
-            <w:r>
-              <w:rPr>
-                <w:sz w:val="18"/>
-                <w:szCs w:val="18"/>
-              </w:rPr>
-              <w:t xml:space="preserve"/>
-            </w:r>
-          </w:p>
-        </w:tc>
-      </w:tr>
-    </w:tbl>
+    <w:p>
+      <w:pPr>
+        <w:spacing w:after="120"/>
+        <w:jc w:val="center"/>
+      </w:pPr>
+      <w:r>
+        <w:drawing>
+          <wp:inline xmlns:a="http://schemas.openxmlformats.org/drawingml/2006/main" xmlns:pic="http://schemas.openxmlformats.org/drawingml/2006/picture">
+            <wp:extent cx="4023360" cy="4522746"/>
+            <wp:docPr id="109" name="capture_masque.jpg"/>
+            <wp:cNvGraphicFramePr>
+              <a:graphicFrameLocks noChangeAspect="1"/>
+            </wp:cNvGraphicFramePr>
+            <a:graphic>
+              <a:graphicData uri="http://schemas.openxmlformats.org/drawingml/2006/picture">
+                <pic:pic>
+                  <pic:nvPicPr>
+                    <pic:cNvPr id="0" name="capture_masque.jpg"/>
+                    <pic:cNvPicPr/>
+                  </pic:nvPicPr>
+                  <pic:blipFill>
+                    <a:blip r:embed="rIdImg9"/>
+                    <a:stretch>
+                      <a:fillRect/>
+                    </a:stretch>
+                  </pic:blipFill>
+                  <pic:spPr>
+                    <a:xfrm>
+                      <a:off x="0" y="0"/>
+                      <a:ext cx="4023360" cy="4522746"/>
+                    </a:xfrm>
+                    <a:prstGeom prst="rect"/>
+                  </pic:spPr>
+                </pic:pic>
+              </a:graphicData>
+            </a:graphic>
+          </wp:inline>
+        </w:drawing>
+      </w:r>
+    </w:p>
     <w:p>
       <w:pPr>
         <w:spacing w:after="220" w:before="80" w:line="276"/>
@@ -3571,130 +3348,46 @@
         <w:t xml:space="preserve">Figure 5 — Faux positif — mouton détecté comme bovin</w:t>
       </w:r>
     </w:p>
-    <w:tbl>
-      <w:tblPr>
-        <w:tblW w:type="dxa" w:w="9360"/>
-        <w:tblBorders>
-          <w:top w:val="dashed" w:color="2E74B5" w:sz="8"/>
-          <w:left w:val="dashed" w:color="2E74B5" w:sz="8"/>
-          <w:bottom w:val="dashed" w:color="2E74B5" w:sz="8"/>
-          <w:right w:val="dashed" w:color="2E74B5" w:sz="8"/>
-          <w:insideH w:val="single" w:color="auto" w:sz="4"/>
-          <w:insideV w:val="single" w:color="auto" w:sz="4"/>
-        </w:tblBorders>
-      </w:tblPr>
-      <w:tblGrid>
-        <w:gridCol w:w="9360"/>
-      </w:tblGrid>
-      <w:tr>
-        <w:tc>
-          <w:tcPr>
-            <w:tcW w:type="dxa" w:w="9360"/>
-            <w:shd w:fill="FAFCFF" w:color="auto" w:val="clear"/>
-            <w:tcMar>
-              <w:top w:type="dxa" w:w="240"/>
-              <w:left w:type="dxa" w:w="200"/>
-              <w:bottom w:type="dxa" w:w="240"/>
-              <w:right w:type="dxa" w:w="200"/>
-            </w:tcMar>
-          </w:tcPr>
-          <w:p>
-            <w:pPr>
-              <w:spacing w:after="0"/>
-            </w:pPr>
-            <w:r>
-              <w:rPr>
-                <w:sz w:val="18"/>
-                <w:szCs w:val="18"/>
-              </w:rPr>
-              <w:t xml:space="preserve"/>
-            </w:r>
-          </w:p>
-          <w:p>
-            <w:pPr>
-              <w:spacing w:after="0"/>
-            </w:pPr>
-            <w:r>
-              <w:rPr>
-                <w:sz w:val="18"/>
-                <w:szCs w:val="18"/>
-              </w:rPr>
-              <w:t xml:space="preserve"/>
-            </w:r>
-          </w:p>
-          <w:p>
-            <w:pPr>
-              <w:spacing w:after="100" w:before="0" w:line="276"/>
-              <w:jc w:val="center"/>
-            </w:pPr>
-            <w:r>
-              <w:rPr>
-                <w:rFonts w:ascii="Calibri" w:cs="Calibri" w:eastAsia="Calibri" w:hAnsi="Calibri"/>
-                <w:b/>
-                <w:bCs/>
-                <w:color w:val="2E74B5"/>
-                <w:sz w:val="20"/>
-                <w:szCs w:val="20"/>
-              </w:rPr>
-              <w:t xml:space="preserve">[ ESPACE RÉSERVÉ — INSÉRER LA CAPTURE D'ÉCRAN ICI ]</w:t>
-            </w:r>
-          </w:p>
-          <w:p>
-            <w:pPr>
-              <w:spacing w:after="0" w:before="0" w:line="276"/>
-              <w:jc w:val="center"/>
-            </w:pPr>
-            <w:r>
-              <w:rPr>
-                <w:rFonts w:ascii="Calibri" w:cs="Calibri" w:eastAsia="Calibri" w:hAnsi="Calibri"/>
-                <w:i/>
-                <w:iCs/>
-                <w:color w:val="808080"/>
-                <w:sz w:val="18"/>
-                <w:szCs w:val="18"/>
-              </w:rPr>
-              <w:t xml:space="preserve">Suggestion : capture de référence sur une vidéo de bovins, à placer en regard des deux précédentes pour la comparaison.</w:t>
-            </w:r>
-          </w:p>
-          <w:p>
-            <w:pPr>
-              <w:spacing w:after="0"/>
-            </w:pPr>
-            <w:r>
-              <w:rPr>
-                <w:sz w:val="18"/>
-                <w:szCs w:val="18"/>
-              </w:rPr>
-              <w:t xml:space="preserve"/>
-            </w:r>
-          </w:p>
-          <w:p>
-            <w:pPr>
-              <w:spacing w:after="0"/>
-            </w:pPr>
-            <w:r>
-              <w:rPr>
-                <w:sz w:val="18"/>
-                <w:szCs w:val="18"/>
-              </w:rPr>
-              <w:t xml:space="preserve"/>
-            </w:r>
-          </w:p>
-          <w:p>
-            <w:pPr>
-              <w:spacing w:after="0"/>
-            </w:pPr>
-            <w:r>
-              <w:rPr>
-                <w:sz w:val="18"/>
-                <w:szCs w:val="18"/>
-              </w:rPr>
-              <w:t xml:space="preserve"/>
-            </w:r>
-          </w:p>
-        </w:tc>
-      </w:tr>
-    </w:tbl>
+    <w:p>
+      <w:pPr>
+        <w:spacing w:after="120"/>
+        <w:jc w:val="center"/>
+      </w:pPr>
+      <w:r>
+        <w:drawing>
+          <wp:inline xmlns:a="http://schemas.openxmlformats.org/drawingml/2006/main" xmlns:pic="http://schemas.openxmlformats.org/drawingml/2006/picture">
+            <wp:extent cx="5669280" cy="3186480"/>
+            <wp:docPr id="110" name="capture_nominal.jpg"/>
+            <wp:cNvGraphicFramePr>
+              <a:graphicFrameLocks noChangeAspect="1"/>
+            </wp:cNvGraphicFramePr>
+            <a:graphic>
+              <a:graphicData uri="http://schemas.openxmlformats.org/drawingml/2006/picture">
+                <pic:pic>
+                  <pic:nvPicPr>
+                    <pic:cNvPr id="0" name="capture_nominal.jpg"/>
+                    <pic:cNvPicPr/>
+                  </pic:nvPicPr>
+                  <pic:blipFill>
+                    <a:blip r:embed="rIdImg10"/>
+                    <a:stretch>
+                      <a:fillRect/>
+                    </a:stretch>
+                  </pic:blipFill>
+                  <pic:spPr>
+                    <a:xfrm>
+                      <a:off x="0" y="0"/>
+                      <a:ext cx="5669280" cy="3186480"/>
+                    </a:xfrm>
+                    <a:prstGeom prst="rect"/>
+                  </pic:spPr>
+                </pic:pic>
+              </a:graphicData>
+            </a:graphic>
+          </wp:inline>
+        </w:drawing>
+      </w:r>
+    </w:p>
     <w:p>
       <w:pPr>
         <w:spacing w:after="220" w:before="80" w:line="276"/>
@@ -7803,130 +7496,86 @@
         <w:t xml:space="preserve"/>
       </w:r>
     </w:p>
-    <w:tbl>
-      <w:tblPr>
-        <w:tblW w:type="dxa" w:w="9360"/>
-        <w:tblBorders>
-          <w:top w:val="dashed" w:color="2E74B5" w:sz="8"/>
-          <w:left w:val="dashed" w:color="2E74B5" w:sz="8"/>
-          <w:bottom w:val="dashed" w:color="2E74B5" w:sz="8"/>
-          <w:right w:val="dashed" w:color="2E74B5" w:sz="8"/>
-          <w:insideH w:val="single" w:color="auto" w:sz="4"/>
-          <w:insideV w:val="single" w:color="auto" w:sz="4"/>
-        </w:tblBorders>
-      </w:tblPr>
-      <w:tblGrid>
-        <w:gridCol w:w="9360"/>
-      </w:tblGrid>
-      <w:tr>
-        <w:tc>
-          <w:tcPr>
-            <w:tcW w:type="dxa" w:w="9360"/>
-            <w:shd w:fill="FAFCFF" w:color="auto" w:val="clear"/>
-            <w:tcMar>
-              <w:top w:type="dxa" w:w="240"/>
-              <w:left w:type="dxa" w:w="200"/>
-              <w:bottom w:type="dxa" w:w="240"/>
-              <w:right w:type="dxa" w:w="200"/>
-            </w:tcMar>
-          </w:tcPr>
-          <w:p>
-            <w:pPr>
-              <w:spacing w:after="0"/>
-            </w:pPr>
-            <w:r>
-              <w:rPr>
-                <w:sz w:val="18"/>
-                <w:szCs w:val="18"/>
-              </w:rPr>
-              <w:t xml:space="preserve"/>
-            </w:r>
-          </w:p>
-          <w:p>
-            <w:pPr>
-              <w:spacing w:after="0"/>
-            </w:pPr>
-            <w:r>
-              <w:rPr>
-                <w:sz w:val="18"/>
-                <w:szCs w:val="18"/>
-              </w:rPr>
-              <w:t xml:space="preserve"/>
-            </w:r>
-          </w:p>
-          <w:p>
-            <w:pPr>
-              <w:spacing w:after="100" w:before="0" w:line="276"/>
-              <w:jc w:val="center"/>
-            </w:pPr>
-            <w:r>
-              <w:rPr>
-                <w:rFonts w:ascii="Calibri" w:cs="Calibri" w:eastAsia="Calibri" w:hAnsi="Calibri"/>
-                <w:b/>
-                <w:bCs/>
-                <w:color w:val="2E74B5"/>
-                <w:sz w:val="20"/>
-                <w:szCs w:val="20"/>
-              </w:rPr>
-              <w:t xml:space="preserve">[ ESPACE RÉSERVÉ — INSÉRER LA CAPTURE D'ÉCRAN ICI ]</w:t>
-            </w:r>
-          </w:p>
-          <w:p>
-            <w:pPr>
-              <w:spacing w:after="0" w:before="0" w:line="276"/>
-              <w:jc w:val="center"/>
-            </w:pPr>
-            <w:r>
-              <w:rPr>
-                <w:rFonts w:ascii="Calibri" w:cs="Calibri" w:eastAsia="Calibri" w:hAnsi="Calibri"/>
-                <w:i/>
-                <w:iCs/>
-                <w:color w:val="808080"/>
-                <w:sz w:val="18"/>
-                <w:szCs w:val="18"/>
-              </w:rPr>
-              <w:t xml:space="preserve">Suggestion : capture de la scène qui échouait auparavant, montrant les animaux désormais correctement étiquetés.</w:t>
-            </w:r>
-          </w:p>
-          <w:p>
-            <w:pPr>
-              <w:spacing w:after="0"/>
-            </w:pPr>
-            <w:r>
-              <w:rPr>
-                <w:sz w:val="18"/>
-                <w:szCs w:val="18"/>
-              </w:rPr>
-              <w:t xml:space="preserve"/>
-            </w:r>
-          </w:p>
-          <w:p>
-            <w:pPr>
-              <w:spacing w:after="0"/>
-            </w:pPr>
-            <w:r>
-              <w:rPr>
-                <w:sz w:val="18"/>
-                <w:szCs w:val="18"/>
-              </w:rPr>
-              <w:t xml:space="preserve"/>
-            </w:r>
-          </w:p>
-          <w:p>
-            <w:pPr>
-              <w:spacing w:after="0"/>
-            </w:pPr>
-            <w:r>
-              <w:rPr>
-                <w:sz w:val="18"/>
-                <w:szCs w:val="18"/>
-              </w:rPr>
-              <w:t xml:space="preserve"/>
-            </w:r>
-          </w:p>
-        </w:tc>
-      </w:tr>
-    </w:tbl>
+    <w:p>
+      <w:pPr>
+        <w:spacing w:after="120"/>
+        <w:jc w:val="center"/>
+      </w:pPr>
+      <w:r>
+        <w:drawing>
+          <wp:inline xmlns:a="http://schemas.openxmlformats.org/drawingml/2006/main" xmlns:pic="http://schemas.openxmlformats.org/drawingml/2006/picture">
+            <wp:extent cx="5120640" cy="5792199"/>
+            <wp:docPr id="1" name="Picture 1"/>
+            <wp:cNvGraphicFramePr>
+              <a:graphicFrameLocks noChangeAspect="1"/>
+            </wp:cNvGraphicFramePr>
+            <a:graphic>
+              <a:graphicData uri="http://schemas.openxmlformats.org/drawingml/2006/picture">
+                <pic:pic>
+                  <pic:nvPicPr>
+                    <pic:cNvPr id="0" name="fig_rappel_troupeau.jpg"/>
+                    <pic:cNvPicPr/>
+                  </pic:nvPicPr>
+                  <pic:blipFill>
+                    <a:blip r:embed="rId8"/>
+                    <a:stretch>
+                      <a:fillRect/>
+                    </a:stretch>
+                  </pic:blipFill>
+                  <pic:spPr>
+                    <a:xfrm>
+                      <a:off x="0" y="0"/>
+                      <a:ext cx="5120640" cy="5792199"/>
+                    </a:xfrm>
+                    <a:prstGeom prst="rect"/>
+                  </pic:spPr>
+                </pic:pic>
+              </a:graphicData>
+            </a:graphic>
+          </wp:inline>
+        </w:drawing>
+      </w:r>
+    </w:p>
+    <w:p>
+      <w:pPr>
+        <w:spacing w:after="120"/>
+        <w:jc w:val="center"/>
+      </w:pPr>
+      <w:r>
+        <w:drawing>
+          <wp:inline xmlns:a="http://schemas.openxmlformats.org/drawingml/2006/main" xmlns:pic="http://schemas.openxmlformats.org/drawingml/2006/picture">
+            <wp:extent cx="5669280" cy="3186480"/>
+            <wp:docPr id="111" name="capture_pature.jpg"/>
+            <wp:cNvGraphicFramePr>
+              <a:graphicFrameLocks noChangeAspect="1"/>
+            </wp:cNvGraphicFramePr>
+            <a:graphic>
+              <a:graphicData uri="http://schemas.openxmlformats.org/drawingml/2006/picture">
+                <pic:pic>
+                  <pic:nvPicPr>
+                    <pic:cNvPr id="0" name="capture_pature.jpg"/>
+                    <pic:cNvPicPr/>
+                  </pic:nvPicPr>
+                  <pic:blipFill>
+                    <a:blip r:embed="rIdImg11"/>
+                    <a:stretch>
+                      <a:fillRect/>
+                    </a:stretch>
+                  </pic:blipFill>
+                  <pic:spPr>
+                    <a:xfrm>
+                      <a:off x="0" y="0"/>
+                      <a:ext cx="5669280" cy="3186480"/>
+                    </a:xfrm>
+                    <a:prstGeom prst="rect"/>
+                  </pic:spPr>
+                </pic:pic>
+              </a:graphicData>
+            </a:graphic>
+          </wp:inline>
+        </w:drawing>
+      </w:r>
+    </w:p>
     <w:p>
       <w:pPr>
         <w:spacing w:after="220" w:before="80" w:line="276"/>
@@ -7952,6 +7601,788 @@
     <w:p>
       <w:pPr>
         <w:pStyle w:val="Heading1"/>
+        <w:spacing w:after="120"/>
+        <w:jc w:val="left"/>
+      </w:pPr>
+      <w:r/>
+      <w:r>
+        <w:rPr>
+          <w:rFonts w:ascii="Calibri" w:hAnsi="Calibri"/>
+          <w:sz w:val="22"/>
+        </w:rPr>
+        <w:t>11. Étape 9 — Posture couchée et rappel de détection en troupeau</w:t>
+      </w:r>
+    </w:p>
+    <w:p>
+      <w:pPr>
+        <w:pStyle w:val="Heading2"/>
+        <w:spacing w:after="120"/>
+        <w:jc w:val="left"/>
+      </w:pPr>
+      <w:r/>
+      <w:r>
+        <w:rPr>
+          <w:rFonts w:ascii="Calibri" w:hAnsi="Calibri"/>
+          <w:sz w:val="22"/>
+        </w:rPr>
+        <w:t>Les deux symptômes observés</w:t>
+      </w:r>
+    </w:p>
+    <w:p>
+      <w:pPr>
+        <w:spacing w:after="120"/>
+        <w:jc w:val="left"/>
+      </w:pPr>
+      <w:r/>
+      <w:r>
+        <w:rPr>
+          <w:rFonts w:ascii="Calibri" w:hAnsi="Calibri"/>
+          <w:sz w:val="22"/>
+        </w:rPr>
+        <w:t>Deux défauts distincts apparaissaient simultanément à l'écran sur les séquences de stabulation, ce qui rendait leur diagnostic confus. Ils sont pourtant indépendants et relèvent de deux couches différentes du système.</w:t>
+      </w:r>
+    </w:p>
+    <w:p>
+      <w:pPr>
+        <w:pStyle w:val="ListParagraph"/>
+        <w:spacing w:after="120"/>
+        <w:jc w:val="left"/>
+      </w:pPr>
+      <w:r/>
+      <w:r>
+        <w:rPr>
+          <w:rFonts w:ascii="Calibri" w:hAnsi="Calibri"/>
+          <w:sz w:val="22"/>
+        </w:rPr>
+        <w:t>Un bovin manifestement couché portait l'étiquette « pâture ». L'erreur n'était pas anecdotique : sur une séquence de terrain, la totalité des images où un animal était couché produisait cette étiquette, soit un état sanitaire majeur (décubitus prolongé) rendu invisible à l'éleveur.</w:t>
+      </w:r>
+    </w:p>
+    <w:p>
+      <w:pPr>
+        <w:pStyle w:val="ListParagraph"/>
+        <w:spacing w:after="120"/>
+        <w:jc w:val="left"/>
+      </w:pPr>
+      <w:r/>
+      <w:r>
+        <w:rPr>
+          <w:rFonts w:ascii="Calibri" w:hAnsi="Calibri"/>
+          <w:sz w:val="22"/>
+        </w:rPr>
+        <w:t>Une large part du troupeau restait non détectée, donc non nommée : les animaux d'arrière-plan n'apparaissaient tout simplement pas, et ceux qui apparaissaient portaient souvent un point d'interrogation à la place de leur nom.</w:t>
+      </w:r>
+    </w:p>
+    <w:p>
+      <w:pPr>
+        <w:pStyle w:val="Heading2"/>
+        <w:spacing w:after="120"/>
+        <w:jc w:val="left"/>
+      </w:pPr>
+      <w:r/>
+      <w:r>
+        <w:rPr>
+          <w:rFonts w:ascii="Calibri" w:hAnsi="Calibri"/>
+          <w:sz w:val="22"/>
+        </w:rPr>
+        <w:t>Diagnostic 1 — pourquoi un bovin couché était classé « pâture »</w:t>
+      </w:r>
+    </w:p>
+    <w:p>
+      <w:pPr>
+        <w:spacing w:after="120"/>
+        <w:jc w:val="left"/>
+      </w:pPr>
+      <w:r/>
+      <w:r>
+        <w:rPr>
+          <w:rFonts w:ascii="Calibri" w:hAnsi="Calibri"/>
+          <w:sz w:val="22"/>
+        </w:rPr>
+        <w:t>L'étape 8 avait remplacé le ratio d'aspect par un signal de silhouette : la plus longue plage horizontale continue de masque dans la bande basse de la boîte. Un bovin debout n'y présente que des sabots (plages étroites) ; un bovin qui broute y pose son mufle (plage large). Le critère discrimine correctement ces deux cas.</w:t>
+      </w:r>
+    </w:p>
+    <w:p>
+      <w:pPr>
+        <w:spacing w:after="120"/>
+        <w:jc w:val="left"/>
+      </w:pPr>
+      <w:r/>
+      <w:r>
+        <w:rPr>
+          <w:rFonts w:ascii="Calibri" w:hAnsi="Calibri"/>
+          <w:sz w:val="22"/>
+        </w:rPr>
+        <w:t>Il n'avait pas été confronté au troisième. Un bovin couché pose son flanc entier au sol : sa plage continue occupe 60 à 95 % de la largeur de la boîte, soit bien au-delà du seuil du mufle. Le détecteur de tête basse se déclenchait donc à coup sûr, et l'analyseur de comportement forçait alors l'étiquette « pâture ». Autrement dit, la posture la plus éloignée du broutage était celle qui déclenchait le plus fortement son détecteur.</w:t>
+      </w:r>
+    </w:p>
+    <w:p>
+      <w:pPr>
+        <w:spacing w:after="120"/>
+        <w:jc w:val="center"/>
+      </w:pPr>
+      <w:r>
+        <w:drawing>
+          <wp:inline xmlns:a="http://schemas.openxmlformats.org/drawingml/2006/main" xmlns:pic="http://schemas.openxmlformats.org/drawingml/2006/picture">
+            <wp:extent cx="5760720" cy="1810859"/>
+            <wp:docPr id="2" name="Picture 2"/>
+            <wp:cNvGraphicFramePr>
+              <a:graphicFrameLocks noChangeAspect="1"/>
+            </wp:cNvGraphicFramePr>
+            <a:graphic>
+              <a:graphicData uri="http://schemas.openxmlformats.org/drawingml/2006/picture">
+                <pic:pic>
+                  <pic:nvPicPr>
+                    <pic:cNvPr id="0" name="fig_signal_bande_basse.png"/>
+                    <pic:cNvPicPr/>
+                  </pic:nvPicPr>
+                  <pic:blipFill>
+                    <a:blip r:embed="rId9"/>
+                    <a:stretch>
+                      <a:fillRect/>
+                    </a:stretch>
+                  </pic:blipFill>
+                  <pic:spPr>
+                    <a:xfrm>
+                      <a:off x="0" y="0"/>
+                      <a:ext cx="5760720" cy="1810859"/>
+                    </a:xfrm>
+                    <a:prstGeom prst="rect"/>
+                  </pic:spPr>
+                </pic:pic>
+              </a:graphicData>
+            </a:graphic>
+          </wp:inline>
+        </w:drawing>
+      </w:r>
+    </w:p>
+    <w:p>
+      <w:pPr>
+        <w:spacing w:after="120"/>
+        <w:jc w:val="center"/>
+      </w:pPr>
+      <w:r/>
+      <w:r>
+        <w:rPr>
+          <w:rFonts w:ascii="Calibri" w:hAnsi="Calibri"/>
+          <w:i/>
+          <w:color w:val="606060"/>
+          <w:sz w:val="18"/>
+        </w:rPr>
+        <w:t>Figure 12 — Le signal au ras du sol pour les trois postures. La bande analysée est surlignée. Debout et pâture se séparent par la plage maximale ; pâture et couché se séparent par le taux de remplissage de la bande, qu'un mufle ne peut pas saturer.</w:t>
+      </w:r>
+    </w:p>
+    <w:p>
+      <w:pPr>
+        <w:pStyle w:val="Heading2"/>
+        <w:spacing w:after="120"/>
+        <w:jc w:val="left"/>
+      </w:pPr>
+      <w:r/>
+      <w:r>
+        <w:rPr>
+          <w:rFonts w:ascii="Calibri" w:hAnsi="Calibri"/>
+          <w:sz w:val="22"/>
+        </w:rPr>
+        <w:t>Correction 1 — un second discriminant, et une priorité explicite</w:t>
+      </w:r>
+    </w:p>
+    <w:p>
+      <w:pPr>
+        <w:spacing w:after="120"/>
+        <w:jc w:val="left"/>
+      </w:pPr>
+      <w:r/>
+      <w:r>
+        <w:rPr>
+          <w:rFonts w:ascii="Calibri" w:hAnsi="Calibri"/>
+          <w:sz w:val="22"/>
+        </w:rPr>
+        <w:t>La plage maximale ne suffit plus seule : on lui adjoint le taux de remplissage de la bande basse. Un mufle laisse les espaces entre-pattes vides (≈ 0,35) ; un flanc couché sature la bande (≈ 0,90). Au-delà de 0,55 de plage ET 0,50 de remplissage, la posture est déclarée couchée, et le drapeau de tête basse est explicitement remis à zéro — un animal couché ne peut pas être simultanément en train de brouter.</w:t>
+      </w:r>
+    </w:p>
+    <w:p>
+      <w:pPr>
+        <w:spacing w:after="120"/>
+        <w:jc w:val="left"/>
+      </w:pPr>
+      <w:r/>
+      <w:r>
+        <w:rPr>
+          <w:rFonts w:ascii="Calibri" w:hAnsi="Calibri"/>
+          <w:sz w:val="22"/>
+        </w:rPr>
+        <w:t>Un garde-fou s'est révélé indispensable : une boîte tronquée par le bord bas de l'image, ou largement masquée par un congénère, présente elle aussi une bande basse pleine, sans que l'animal soit couché — on ne voit simplement pas ses pattes. Dans ce cas le système s'abstient de conclure plutôt que de conclure à tort.</w:t>
+      </w:r>
+    </w:p>
+    <w:p>
+      <w:pPr>
+        <w:spacing w:after="120"/>
+        <w:jc w:val="left"/>
+      </w:pPr>
+      <w:r/>
+      <w:r>
+        <w:rPr>
+          <w:rFonts w:ascii="Calibri" w:hAnsi="Calibri"/>
+          <w:sz w:val="22"/>
+        </w:rPr>
+        <w:t>Enfin, le verdict est stabilisé par un déclencheur à hystérésis : il faut 80 % d'images en posture couchée sur la fenêtre glissante pour entrer dans l'état, mais il suffit de repasser sous 60 % pour en sortir. Avec un seuil unique, une séquence dont le taux oscille autour de la valeur de bascule change d'état à chaque image : la mesure sur une séquence de terrain relevait 159 transitions « se couche » en soixante images, ce qui rendait le journal d'événements inexploitable. L'écart entre les deux seuils absorbe ce bruit.</w:t>
+      </w:r>
+    </w:p>
+    <w:p>
+      <w:pPr>
+        <w:pStyle w:val="Heading2"/>
+        <w:spacing w:after="120"/>
+        <w:jc w:val="left"/>
+      </w:pPr>
+      <w:r/>
+      <w:r>
+        <w:rPr>
+          <w:rFonts w:ascii="Calibri" w:hAnsi="Calibri"/>
+          <w:sz w:val="22"/>
+        </w:rPr>
+        <w:t>Diagnostic 2 — le rappel de détection est dominé par la résolution</w:t>
+      </w:r>
+    </w:p>
+    <w:p>
+      <w:pPr>
+        <w:spacing w:after="120"/>
+        <w:jc w:val="left"/>
+      </w:pPr>
+      <w:r/>
+      <w:r>
+        <w:rPr>
+          <w:rFonts w:ascii="Calibri" w:hAnsi="Calibri"/>
+          <w:sz w:val="22"/>
+        </w:rPr>
+        <w:t>Le second défaut ne relevait pas du comportement mais du détecteur. Les réglages en vigueur — résolution d'inférence 640 pixels, seuil de confiance 0,40 — avaient été calibrés sur des plans rapprochés de deux ou trois animaux. Sur une vue de troupeau au cornadis, un bovin d'arrière-plan mesure trente à cinquante pixels de large : après les réductions successives de résolution du réseau, il ne subsiste plus assez d'activation pour franchir le seuil.</w:t>
+      </w:r>
+    </w:p>
+    <w:p>
+      <w:pPr>
+        <w:spacing w:after="120"/>
+        <w:jc w:val="left"/>
+      </w:pPr>
+      <w:r/>
+      <w:r>
+        <w:rPr>
+          <w:rFonts w:ascii="Calibri" w:hAnsi="Calibri"/>
+          <w:sz w:val="22"/>
+        </w:rPr>
+        <w:t>Une campagne de mesures sur les séquences de terrain a isolé la contribution de chaque paramètre, à modèle identique (YOLO26-seg, MLX/Metal). Sur une même image de la séquence une vue de troupeau au cornadis : 3 bovins détectés à 640/0,40 ; 12 à 960/0,25 ; 18 à 1280/0,25 ; 21 à 1280/0,20. La résolution domine largement le seuil de confiance, ce qui oriente le réglage.</w:t>
+      </w:r>
+    </w:p>
+    <w:p>
+      <w:pPr>
+        <w:pStyle w:val="Heading2"/>
+        <w:spacing w:after="120"/>
+        <w:jc w:val="left"/>
+      </w:pPr>
+      <w:r/>
+      <w:r>
+        <w:rPr>
+          <w:rFonts w:ascii="Calibri" w:hAnsi="Calibri"/>
+          <w:sz w:val="22"/>
+        </w:rPr>
+        <w:t>Correction 2 — résolution, classes acceptées et doublons</w:t>
+      </w:r>
+    </w:p>
+    <w:p>
+      <w:pPr>
+        <w:pStyle w:val="ListParagraph"/>
+        <w:spacing w:after="120"/>
+        <w:jc w:val="left"/>
+      </w:pPr>
+      <w:r/>
+      <w:r>
+        <w:rPr>
+          <w:rFonts w:ascii="Calibri" w:hAnsi="Calibri"/>
+          <w:sz w:val="22"/>
+        </w:rPr>
+        <w:t>Résolution portée à 1280 et seuil de confiance abaissé à 0,25. Coût mesuré sur M1 Pro : environ 95 ms par image contre 30 ms, soit de l'ordre de dix images par seconde — suffisant pour de la surveillance, et réglable à chaud depuis l'interface.</w:t>
+      </w:r>
+    </w:p>
+    <w:p>
+      <w:pPr>
+        <w:pStyle w:val="ListParagraph"/>
+        <w:spacing w:after="120"/>
+        <w:jc w:val="left"/>
+      </w:pPr>
+      <w:r/>
+      <w:r>
+        <w:rPr>
+          <w:rFonts w:ascii="Calibri" w:hAnsi="Calibri"/>
+          <w:sz w:val="22"/>
+        </w:rPr>
+        <w:t>Trois classes COCO acceptées comme bovin au lieu d'une. Le jeu COCO ne contient qu'une classe « vache », apprise sur des photos de prairie ; sur des animaux de dos, lointains ou serrés, le réseau répartit son score entre « vache », « cheval » et « mouton » sans qu'aucun ne franchisse le seuil. Ce comportement est désactivable lorsque d'autres espèces partagent réellement l'enclos.</w:t>
+      </w:r>
+    </w:p>
+    <w:p>
+      <w:pPr>
+        <w:pStyle w:val="ListParagraph"/>
+        <w:spacing w:after="120"/>
+        <w:jc w:val="left"/>
+      </w:pPr>
+      <w:r/>
+      <w:r>
+        <w:rPr>
+          <w:rFonts w:ascii="Calibri" w:hAnsi="Calibri"/>
+          <w:sz w:val="22"/>
+        </w:rPr>
+        <w:t>Suppression des doublons imbriqués. YOLO26 est entraîné sans suppression non maximale, mais cet apprentissage est lié à la résolution d'entraînement : en montant la résolution d'inférence, un même animal ressort parfois en deux boîtes. Chacune aurait créé une identité distincte en base.</w:t>
+      </w:r>
+    </w:p>
+    <w:p>
+      <w:pPr>
+        <w:pStyle w:val="ListParagraph"/>
+        <w:spacing w:after="120"/>
+        <w:jc w:val="left"/>
+      </w:pPr>
+      <w:r/>
+      <w:r>
+        <w:rPr>
+          <w:rFonts w:ascii="Calibri" w:hAnsi="Calibri"/>
+          <w:sz w:val="22"/>
+        </w:rPr>
+        <w:t>Association des pistes par affectation optimale globale plutôt que par appariement glouton. Dans un troupeau serré, le glouton attribuait une piste au premier bovin qui la recouvrait suffisamment, même si un autre la recouvrait mieux : les identités s'échangeaient entre voisins, et le nom suivait l'échange.</w:t>
+      </w:r>
+    </w:p>
+    <w:p>
+      <w:pPr>
+        <w:spacing w:after="120"/>
+        <w:jc w:val="center"/>
+      </w:pPr>
+      <w:r>
+        <w:drawing>
+          <wp:inline xmlns:a="http://schemas.openxmlformats.org/drawingml/2006/main" xmlns:pic="http://schemas.openxmlformats.org/drawingml/2006/picture">
+            <wp:extent cx="5029200" cy="5688767"/>
+            <wp:docPr id="3" name="Picture 3"/>
+            <wp:cNvGraphicFramePr>
+              <a:graphicFrameLocks noChangeAspect="1"/>
+            </wp:cNvGraphicFramePr>
+            <a:graphic>
+              <a:graphicData uri="http://schemas.openxmlformats.org/drawingml/2006/picture">
+                <pic:pic>
+                  <pic:nvPicPr>
+                    <pic:cNvPr id="0" name="fig_posture_couche.jpg"/>
+                    <pic:cNvPicPr/>
+                  </pic:nvPicPr>
+                  <pic:blipFill>
+                    <a:blip r:embed="rId10"/>
+                    <a:stretch>
+                      <a:fillRect/>
+                    </a:stretch>
+                  </pic:blipFill>
+                  <pic:spPr>
+                    <a:xfrm>
+                      <a:off x="0" y="0"/>
+                      <a:ext cx="5029200" cy="5688767"/>
+                    </a:xfrm>
+                    <a:prstGeom prst="rect"/>
+                  </pic:spPr>
+                </pic:pic>
+              </a:graphicData>
+            </a:graphic>
+          </wp:inline>
+        </w:drawing>
+      </w:r>
+    </w:p>
+    <w:p>
+      <w:pPr>
+        <w:spacing w:after="120"/>
+        <w:jc w:val="center"/>
+      </w:pPr>
+      <w:r/>
+      <w:r>
+        <w:rPr>
+          <w:rFonts w:ascii="Calibri" w:hAnsi="Calibri"/>
+          <w:i/>
+          <w:color w:val="606060"/>
+          <w:sz w:val="18"/>
+        </w:rPr>
+        <w:t>Figure 13 — Séquence de terrain, avant (haut) et après (bas). Avant : quatre bovins détectés, et le groupe couché au centre est soit ignoré, soit étiqueté « pâture ». Après : six bovins, et les animaux couchés sont reconnus comme tels.</w:t>
+      </w:r>
+    </w:p>
+    <w:p>
+      <w:pPr>
+        <w:spacing w:after="120"/>
+        <w:jc w:val="center"/>
+      </w:pPr>
+      <w:r>
+        <w:drawing>
+          <wp:inline xmlns:a="http://schemas.openxmlformats.org/drawingml/2006/main" xmlns:pic="http://schemas.openxmlformats.org/drawingml/2006/picture">
+            <wp:extent cx="5029200" cy="5681424"/>
+            <wp:docPr id="4" name="Picture 4"/>
+            <wp:cNvGraphicFramePr>
+              <a:graphicFrameLocks noChangeAspect="1"/>
+            </wp:cNvGraphicFramePr>
+            <a:graphic>
+              <a:graphicData uri="http://schemas.openxmlformats.org/drawingml/2006/picture">
+                <pic:pic>
+                  <pic:nvPicPr>
+                    <pic:cNvPr id="0" name="fig_rappel_grand_troupeau.jpg"/>
+                    <pic:cNvPicPr/>
+                  </pic:nvPicPr>
+                  <pic:blipFill>
+                    <a:blip r:embed="rId11"/>
+                    <a:stretch>
+                      <a:fillRect/>
+                    </a:stretch>
+                  </pic:blipFill>
+                  <pic:spPr>
+                    <a:xfrm>
+                      <a:off x="0" y="0"/>
+                      <a:ext cx="5029200" cy="5681424"/>
+                    </a:xfrm>
+                    <a:prstGeom prst="rect"/>
+                  </pic:spPr>
+                </pic:pic>
+              </a:graphicData>
+            </a:graphic>
+          </wp:inline>
+        </w:drawing>
+      </w:r>
+    </w:p>
+    <w:p>
+      <w:pPr>
+        <w:spacing w:after="120"/>
+        <w:jc w:val="center"/>
+      </w:pPr>
+      <w:r/>
+      <w:r>
+        <w:rPr>
+          <w:rFonts w:ascii="Calibri" w:hAnsi="Calibri"/>
+          <w:i/>
+          <w:color w:val="606060"/>
+          <w:sz w:val="18"/>
+        </w:rPr>
+        <w:t>Figure 14 — Séquence de troupeau distant, avant (haut) et après (bas). C'est le cas le plus défavorable à l'ancien réglage : troupeau nombreux et distant, où presque aucun animal n'était détecté.</w:t>
+      </w:r>
+    </w:p>
+    <w:p>
+      <w:pPr>
+        <w:spacing w:after="120"/>
+        <w:jc w:val="center"/>
+      </w:pPr>
+      <w:r>
+        <w:drawing>
+          <wp:inline xmlns:a="http://schemas.openxmlformats.org/drawingml/2006/main" xmlns:pic="http://schemas.openxmlformats.org/drawingml/2006/picture">
+            <wp:extent cx="5852160" cy="2578918"/>
+            <wp:docPr id="5" name="Picture 5"/>
+            <wp:cNvGraphicFramePr>
+              <a:graphicFrameLocks noChangeAspect="1"/>
+            </wp:cNvGraphicFramePr>
+            <a:graphic>
+              <a:graphicData uri="http://schemas.openxmlformats.org/drawingml/2006/picture">
+                <pic:pic>
+                  <pic:nvPicPr>
+                    <pic:cNvPr id="0" name="fig_rappel_barres.png"/>
+                    <pic:cNvPicPr/>
+                  </pic:nvPicPr>
+                  <pic:blipFill>
+                    <a:blip r:embed="rId12"/>
+                    <a:stretch>
+                      <a:fillRect/>
+                    </a:stretch>
+                  </pic:blipFill>
+                  <pic:spPr>
+                    <a:xfrm>
+                      <a:off x="0" y="0"/>
+                      <a:ext cx="5852160" cy="2578918"/>
+                    </a:xfrm>
+                    <a:prstGeom prst="rect"/>
+                  </pic:spPr>
+                </pic:pic>
+              </a:graphicData>
+            </a:graphic>
+          </wp:inline>
+        </w:drawing>
+      </w:r>
+    </w:p>
+    <w:p>
+      <w:pPr>
+        <w:spacing w:after="120"/>
+        <w:jc w:val="center"/>
+      </w:pPr>
+      <w:r/>
+      <w:r>
+        <w:rPr>
+          <w:rFonts w:ascii="Calibri" w:hAnsi="Calibri"/>
+          <w:i/>
+          <w:color w:val="606060"/>
+          <w:sz w:val="18"/>
+        </w:rPr>
+        <w:t>Figure 15 — Nombre moyen de bovins détectés par image sur neuf séquences, cent quatre-vingts images chacune. Le gain est nul quand la scène ne contient que des sujets proches, et maximal quand elle contient des animaux d'arrière-plan.</w:t>
+      </w:r>
+    </w:p>
+    <w:p>
+      <w:pPr>
+        <w:pStyle w:val="Heading2"/>
+        <w:spacing w:after="120"/>
+        <w:jc w:val="left"/>
+      </w:pPr>
+      <w:r/>
+      <w:r>
+        <w:rPr>
+          <w:rFonts w:ascii="Calibri" w:hAnsi="Calibri"/>
+          <w:sz w:val="22"/>
+        </w:rPr>
+        <w:t>Résultats mesurés</w:t>
+      </w:r>
+    </w:p>
+    <w:p>
+      <w:pPr>
+        <w:spacing w:after="120"/>
+        <w:jc w:val="left"/>
+      </w:pPr>
+      <w:r/>
+      <w:r>
+        <w:rPr>
+          <w:rFonts w:ascii="Calibri" w:hAnsi="Calibri"/>
+          <w:sz w:val="22"/>
+        </w:rPr>
+        <w:t>Sur les neuf séquences évaluées, le nombre moyen de bovins détectés par image passe de 5.6 à 10.5. Les écarts individuels sont très inégaux, et c'est attendu : sur une vue de troupeau au cornadis la moyenne passe de 7.1 à 13.3 ; sur une séquence de troupeau distant, de 1.8 à 22.9. À l'inverse, sur les plans rapprochés le gain est marginal — il n'y avait rien à récupérer.</w:t>
+      </w:r>
+    </w:p>
+    <w:p>
+      <w:pPr>
+        <w:spacing w:after="120"/>
+        <w:jc w:val="left"/>
+      </w:pPr>
+      <w:r/>
+      <w:r>
+        <w:rPr>
+          <w:rFonts w:ascii="Calibri" w:hAnsi="Calibri"/>
+          <w:sz w:val="22"/>
+        </w:rPr>
+        <w:t>Sur le volet posture, une séquence de terrain illustre le mieux la correction. Avec l'ancienne logique, aucune image ne portait l'étiquette « couché » et 544 étiquettes « pâture » étaient émises. Avec la nouvelle, 235 images portent « couché » et les « pâture » tombent à 136, la différence correspondant aux animaux effectivement allongés.</w:t>
+      </w:r>
+    </w:p>
+    <w:p>
+      <w:pPr>
+        <w:pStyle w:val="Heading2"/>
+        <w:spacing w:after="120"/>
+        <w:jc w:val="left"/>
+      </w:pPr>
+      <w:r/>
+      <w:r>
+        <w:rPr>
+          <w:rFonts w:ascii="Calibri" w:hAnsi="Calibri"/>
+          <w:sz w:val="22"/>
+        </w:rPr>
+        <w:t>Comportements ajoutés</w:t>
+      </w:r>
+    </w:p>
+    <w:p>
+      <w:pPr>
+        <w:spacing w:after="120"/>
+        <w:jc w:val="left"/>
+      </w:pPr>
+      <w:r/>
+      <w:r>
+        <w:rPr>
+          <w:rFonts w:ascii="Calibri" w:hAnsi="Calibri"/>
+          <w:sz w:val="22"/>
+        </w:rPr>
+        <w:t>La correction ouvrait la possibilité de décrire des états jusque-là absents. Quatre étiquettes s'ajoutent aux sept existantes.</w:t>
+      </w:r>
+    </w:p>
+    <w:p>
+      <w:pPr>
+        <w:pStyle w:val="ListParagraph"/>
+        <w:spacing w:after="120"/>
+        <w:jc w:val="left"/>
+      </w:pPr>
+      <w:r/>
+      <w:r>
+        <w:rPr>
+          <w:rFonts w:ascii="Calibri" w:hAnsi="Calibri"/>
+          <w:sz w:val="22"/>
+        </w:rPr>
+        <w:t>« couché » — posture déduite du masque, désormais distincte de la pâture.</w:t>
+      </w:r>
+    </w:p>
+    <w:p>
+      <w:pPr>
+        <w:pStyle w:val="ListParagraph"/>
+        <w:spacing w:after="120"/>
+        <w:jc w:val="left"/>
+      </w:pPr>
+      <w:r/>
+      <w:r>
+        <w:rPr>
+          <w:rFonts w:ascii="Calibri" w:hAnsi="Calibri"/>
+          <w:sz w:val="22"/>
+        </w:rPr>
+        <w:t>« se couche » et « se lève » — transitions de posture. Elles sont déduites d'un changement d'état et non d'un seuil instantané, et restent affichées environ une seconde et demie, faute de quoi le vote majoritaire les effacerait. C'est l'information la plus utile à l'éleveur : un animal qui peine à se relever est un signal sanitaire précoce.</w:t>
+      </w:r>
+    </w:p>
+    <w:p>
+      <w:pPr>
+        <w:pStyle w:val="ListParagraph"/>
+        <w:spacing w:after="120"/>
+        <w:jc w:val="left"/>
+      </w:pPr>
+      <w:r/>
+      <w:r>
+        <w:rPr>
+          <w:rFonts w:ascii="Calibri" w:hAnsi="Calibri"/>
+          <w:sz w:val="22"/>
+        </w:rPr>
+        <w:t>« rumine » — approximation assumée. La mastication n'est pas observable à cette résolution ; l'état est inféré d'une immobilité prolongée sans mufle au sol, couché ou debout. Cette inférence supposait au préalable de corriger un défaut discret : la durée d'immobilité était calculée à partir de l'historique de positions, lui-même élagué à cinq secondes, ce qui la plafonnait mécaniquement. Aucun seuil supérieur n'était atteignable.</w:t>
+      </w:r>
+    </w:p>
+    <w:p>
+      <w:pPr>
+        <w:pStyle w:val="Heading2"/>
+        <w:spacing w:after="120"/>
+        <w:jc w:val="left"/>
+      </w:pPr>
+      <w:r/>
+      <w:r>
+        <w:rPr>
+          <w:rFonts w:ascii="Calibri" w:hAnsi="Calibri"/>
+          <w:sz w:val="22"/>
+        </w:rPr>
+        <w:t>Deux corrections annexes, découvertes en mesurant</w:t>
+      </w:r>
+    </w:p>
+    <w:p>
+      <w:pPr>
+        <w:pStyle w:val="ListParagraph"/>
+        <w:spacing w:after="120"/>
+        <w:jc w:val="left"/>
+      </w:pPr>
+      <w:r/>
+      <w:r>
+        <w:rPr>
+          <w:rFonts w:ascii="Calibri" w:hAnsi="Calibri"/>
+          <w:sz w:val="22"/>
+        </w:rPr>
+        <w:t>Rafales de « court » et « rué » sur des animaux immobiles. La vitesse était estimée dès trois points d'historique, soit un dixième de seconde à trente images par seconde. À cette échelle, un tremblement de boîte de 10 % de la largeur du corps produit une vitesse apparente d'une largeur de corps par seconde — exactement le seuil de la charge. Une base temporelle minimale d'une demi-seconde est désormais exigée.</w:t>
+      </w:r>
+    </w:p>
+    <w:p>
+      <w:pPr>
+        <w:pStyle w:val="ListParagraph"/>
+        <w:spacing w:after="120"/>
+        <w:jc w:val="left"/>
+      </w:pPr>
+      <w:r/>
+      <w:r>
+        <w:rPr>
+          <w:rFonts w:ascii="Calibri" w:hAnsi="Calibri"/>
+          <w:sz w:val="22"/>
+        </w:rPr>
+        <w:t>Bovins bloqués sur « ? ». La file du calculateur d'empreintes acceptait soixante-quatre lots ; sur un troupeau nombreux elle se remplissait de vignettes périmées pendant que les nouvelles étaient rejetées. La file est maintenant courte et le lot en attente est remplacé par le plus récent — une vignette périmée n'a aucune valeur, l'animal est toujours là à l'image suivante. Les pistes encore anonymes sont en outre servies en priorité.</w:t>
+      </w:r>
+    </w:p>
+    <w:p>
+      <w:pPr>
+        <w:pStyle w:val="Heading2"/>
+        <w:spacing w:after="120"/>
+        <w:jc w:val="left"/>
+      </w:pPr>
+      <w:r/>
+      <w:r>
+        <w:rPr>
+          <w:rFonts w:ascii="Calibri" w:hAnsi="Calibri"/>
+          <w:sz w:val="22"/>
+        </w:rPr>
+        <w:t>Répertoire de noms</w:t>
+      </w:r>
+    </w:p>
+    <w:p>
+      <w:pPr>
+        <w:spacing w:after="120"/>
+        <w:jc w:val="left"/>
+      </w:pPr>
+      <w:r/>
+      <w:r>
+        <w:rPr>
+          <w:rFonts w:ascii="Calibri" w:hAnsi="Calibri"/>
+          <w:sz w:val="22"/>
+        </w:rPr>
+        <w:t>Le répertoire passe de 120 à 330 noms. Au-delà du répertoire, le générateur recyclait les noms avec un indice de cycle « Daphné 2 », ambigu à l'oral comme à l'écran. La contrainte, verrouillée par un test, est que le nom d'un animal est déterminé par le rang de sa clé dans le répertoire : seuls des ajouts en fin de liste sont autorisés, sous peine de renommer rétroactivement des animaux déjà enregistrés.</w:t>
+      </w:r>
+    </w:p>
+    <w:p>
+      <w:pPr>
+        <w:pStyle w:val="Heading2"/>
+        <w:spacing w:after="120"/>
+        <w:jc w:val="left"/>
+      </w:pPr>
+      <w:r/>
+      <w:r>
+        <w:rPr>
+          <w:rFonts w:ascii="Calibri" w:hAnsi="Calibri"/>
+          <w:sz w:val="22"/>
+        </w:rPr>
+        <w:t>Ce que cette étape ne corrige pas</w:t>
+      </w:r>
+    </w:p>
+    <w:p>
+      <w:pPr>
+        <w:pStyle w:val="ListParagraph"/>
+        <w:spacing w:after="120"/>
+        <w:jc w:val="left"/>
+      </w:pPr>
+      <w:r/>
+      <w:r>
+        <w:rPr>
+          <w:rFonts w:ascii="Calibri" w:hAnsi="Calibri"/>
+          <w:sz w:val="22"/>
+        </w:rPr>
+        <w:t>La rumination reste une inférence indirecte, non une observation. Elle n'a pas été validée contre une vérité terrain.</w:t>
+      </w:r>
+    </w:p>
+    <w:p>
+      <w:pPr>
+        <w:pStyle w:val="ListParagraph"/>
+        <w:spacing w:after="120"/>
+        <w:jc w:val="left"/>
+      </w:pPr>
+      <w:r/>
+      <w:r>
+        <w:rPr>
+          <w:rFonts w:ascii="Calibri" w:hAnsi="Calibri"/>
+          <w:sz w:val="22"/>
+        </w:rPr>
+        <w:t>Un bovin couché dont la silhouette fusionne durablement avec celle d'un voisin peut encore échapper à la détection de posture : le système s'abstient alors, ce qui est préférable, mais l'état n'est pas remonté.</w:t>
+      </w:r>
+    </w:p>
+    <w:p>
+      <w:pPr>
+        <w:pStyle w:val="ListParagraph"/>
+        <w:spacing w:after="120"/>
+        <w:jc w:val="left"/>
+      </w:pPr>
+      <w:r/>
+      <w:r>
+        <w:rPr>
+          <w:rFonts w:ascii="Calibri" w:hAnsi="Calibri"/>
+          <w:sz w:val="22"/>
+        </w:rPr>
+        <w:t>Le gain de rappel est mesuré en nombre de détections, non contre un comptage manuel image par image. Il établit un gain relatif net, pas un taux de rappel absolu. Un jeu annoté reste à constituer pour cela.</w:t>
+      </w:r>
+    </w:p>
+    <w:p>
+      <w:pPr>
+        <w:pStyle w:val="ListParagraph"/>
+        <w:spacing w:after="120"/>
+        <w:jc w:val="left"/>
+      </w:pPr>
+      <w:r/>
+      <w:r>
+        <w:rPr>
+          <w:rFonts w:ascii="Calibri" w:hAnsi="Calibri"/>
+          <w:sz w:val="22"/>
+        </w:rPr>
+        <w:t>Le triplement des classes acceptées est un compromis : il récupère des bovins mal classés au prix d'un risque de faux positif si d'autres espèces sont présentes. Le réglage est exposé.</w:t>
+      </w:r>
+    </w:p>
+    <w:p>
+      <w:pPr>
+        <w:pStyle w:val="Heading1"/>
         <w:spacing w:after="180" w:before="360"/>
       </w:pPr>
       <w:r>
@@ -7963,7 +8394,345 @@
           <w:sz w:val="32"/>
           <w:szCs w:val="32"/>
         </w:rPr>
-        <w:t xml:space="preserve">11. Tableau récapitulatif des décisions</w:t>
+        <w:t>12. Étape 10 — Vidéos de terrain au smartphone : comptage et comportements fiabilisés</w:t>
+      </w:r>
+    </w:p>
+    <w:p>
+      <w:pPr>
+        <w:spacing w:after="120"/>
+        <w:jc w:val="left"/>
+      </w:pPr>
+      <w:r>
+        <w:rPr>
+          <w:rFonts w:ascii="Calibri" w:hAnsi="Calibri"/>
+          <w:sz w:val="22"/>
+        </w:rPr>
+        <w:t xml:space="preserve">Les séquences une séquence de terrain à une séquence de terrain, filmées au téléphone et à la main, ont mis le système en difficulté sur trois points visibles à l'écran : beaucoup trop d'animaux comptés, des courses inventées, et des étiquettes qui clignotaient. Chaque défaut a été mesuré, corrigé, puis re-mesuré sur les mêmes séquences.</w:t>
+      </w:r>
+    </w:p>
+    <w:p>
+      <w:pPr>
+        <w:pStyle w:val="Heading2"/>
+        <w:spacing w:after="120"/>
+        <w:jc w:val="left"/>
+      </w:pPr>
+      <w:r/>
+      <w:r>
+        <w:rPr>
+          <w:rFonts w:ascii="Calibri" w:hAnsi="Calibri"/>
+          <w:sz w:val="22"/>
+        </w:rPr>
+        <w:t>Problème 1 — c'est la caméra qui bouge, pas les bœufs</w:t>
+      </w:r>
+    </w:p>
+    <w:p>
+      <w:pPr>
+        <w:spacing w:after="120"/>
+        <w:jc w:val="left"/>
+      </w:pPr>
+      <w:r>
+        <w:rPr>
+          <w:rFonts w:ascii="Calibri" w:hAnsi="Calibri"/>
+          <w:sz w:val="22"/>
+        </w:rPr>
+        <w:t xml:space="preserve">Sur une vidéo tenue à la main, un simple mouvement du téléphone déplace toutes les boîtes en même temps. Le système croyait alors que tous les animaux couraient : des bovins parfaitement immobiles restaient étiquetés « court » ou « rué » pendant des dizaines d'images. La correction estime le mouvement global de la caméra — la médiane des déplacements de toutes les pistes entre deux images — et le soustrait avant de calculer la vitesse de chaque animal. Un animal immobile redevient immobile, même quand la caméra tremble ou balaye la scène.</w:t>
+      </w:r>
+    </w:p>
+    <w:p>
+      <w:pPr>
+        <w:pStyle w:val="Heading2"/>
+        <w:spacing w:after="120"/>
+        <w:jc w:val="left"/>
+      </w:pPr>
+      <w:r/>
+      <w:r>
+        <w:rPr>
+          <w:rFonts w:ascii="Calibri" w:hAnsi="Calibri"/>
+          <w:sz w:val="22"/>
+        </w:rPr>
+        <w:t>Problème 2 — des bœufs fantômes gonflaient le comptage</w:t>
+      </w:r>
+    </w:p>
+    <w:p>
+      <w:pPr>
+        <w:spacing w:after="120"/>
+        <w:jc w:val="left"/>
+      </w:pPr>
+      <w:r>
+        <w:rPr>
+          <w:rFonts w:ascii="Calibri" w:hAnsi="Calibri"/>
+          <w:sz w:val="22"/>
+        </w:rPr>
+        <w:t xml:space="preserve">Chaque piste de suivi, même née d'un artefact de deux ou trois images, créait aussitôt une nouvelle identité en base. Mesure sur une séquence de terrain : 32 bovins créés pour une dizaine d'animaux réellement présents. Deux garde-fous ont été ajoutés. D'abord, une piste doit être vue au moins douze images — environ une demi-seconde — avant de pouvoir créer un nouvel animal ; en attendant, elle affiche « ? ». Ensuite, avant toute création, le système retente un rapprochement avec les animaux déjà connus, à un seuil légèrement abaissé et limité aux animaux hors champ : un bovin revu sous un autre angle est rattaché à sa fiche plutôt que dupliqué. Résultat sur la même séquence : 10 identités au lieu de 32.</w:t>
+      </w:r>
+    </w:p>
+    <w:p>
+      <w:pPr>
+        <w:spacing w:after="120"/>
+        <w:jc w:val="center"/>
+      </w:pPr>
+      <w:r>
+        <w:drawing>
+          <wp:inline xmlns:a="http://schemas.openxmlformats.org/drawingml/2006/main" xmlns:pic="http://schemas.openxmlformats.org/drawingml/2006/picture">
+            <wp:extent cx="5669280" cy="2551176"/>
+            <wp:docPr id="16" name="Picture 16"/>
+            <wp:cNvGraphicFramePr>
+              <a:graphicFrameLocks noChangeAspect="1"/>
+            </wp:cNvGraphicFramePr>
+            <a:graphic>
+              <a:graphicData uri="http://schemas.openxmlformats.org/drawingml/2006/picture">
+                <pic:pic>
+                  <pic:nvPicPr>
+                    <pic:cNvPr id="0" name="fig_identites_avant_apres.png"/>
+                    <pic:cNvPicPr/>
+                  </pic:nvPicPr>
+                  <pic:blipFill>
+                    <a:blip r:embed="rIdFig16"/>
+                    <a:stretch>
+                      <a:fillRect/>
+                    </a:stretch>
+                  </pic:blipFill>
+                  <pic:spPr>
+                    <a:xfrm>
+                      <a:off x="0" y="0"/>
+                      <a:ext cx="5669280" cy="2551176"/>
+                    </a:xfrm>
+                    <a:prstGeom prst="rect"/>
+                  </pic:spPr>
+                </pic:pic>
+              </a:graphicData>
+            </a:graphic>
+          </wp:inline>
+        </w:drawing>
+      </w:r>
+    </w:p>
+    <w:p>
+      <w:pPr>
+        <w:spacing w:after="120"/>
+        <w:jc w:val="center"/>
+      </w:pPr>
+      <w:r/>
+      <w:r>
+        <w:rPr>
+          <w:rFonts w:ascii="Calibri" w:hAnsi="Calibri"/>
+          <w:i/>
+          <w:color w:val="606060"/>
+          <w:sz w:val="18"/>
+        </w:rPr>
+        <w:t>Figure 16 — Identités créées par séquence. La barre rouge montre le sur-comptage mesuré avant correction sur une séquence de terrain ; les barres vertes, le comptage après correction, proche du nombre d'animaux réellement présents dans chaque vidéo.</w:t>
+      </w:r>
+    </w:p>
+    <w:p>
+      <w:pPr>
+        <w:spacing w:after="120"/>
+        <w:jc w:val="center"/>
+      </w:pPr>
+      <w:r>
+        <w:drawing>
+          <wp:inline xmlns:a="http://schemas.openxmlformats.org/drawingml/2006/main" xmlns:pic="http://schemas.openxmlformats.org/drawingml/2006/picture">
+            <wp:extent cx="5669280" cy="3186480"/>
+            <wp:docPr id="112" name="capture_couche.jpg"/>
+            <wp:cNvGraphicFramePr>
+              <a:graphicFrameLocks noChangeAspect="1"/>
+            </wp:cNvGraphicFramePr>
+            <a:graphic>
+              <a:graphicData uri="http://schemas.openxmlformats.org/drawingml/2006/picture">
+                <pic:pic>
+                  <pic:nvPicPr>
+                    <pic:cNvPr id="0" name="capture_couche.jpg"/>
+                    <pic:cNvPicPr/>
+                  </pic:nvPicPr>
+                  <pic:blipFill>
+                    <a:blip r:embed="rIdImg12"/>
+                    <a:stretch>
+                      <a:fillRect/>
+                    </a:stretch>
+                  </pic:blipFill>
+                  <pic:spPr>
+                    <a:xfrm>
+                      <a:off x="0" y="0"/>
+                      <a:ext cx="5669280" cy="3186480"/>
+                    </a:xfrm>
+                    <a:prstGeom prst="rect"/>
+                  </pic:spPr>
+                </pic:pic>
+              </a:graphicData>
+            </a:graphic>
+          </wp:inline>
+        </w:drawing>
+      </w:r>
+    </w:p>
+    <w:p>
+      <w:pPr>
+        <w:spacing w:after="120"/>
+        <w:jc w:val="center"/>
+      </w:pPr>
+      <w:r/>
+      <w:r>
+        <w:rPr>
+          <w:rFonts w:ascii="Calibri" w:hAnsi="Calibri"/>
+          <w:i/>
+          <w:color w:val="606060"/>
+          <w:sz w:val="18"/>
+        </w:rPr>
+        <w:t xml:space="preserve">Figure 17 — Détection de la posture couchée. « Lorenzo couché » est correctement distingué des animaux debout (« immobile ») et de ceux qui broutent (« pâture »), grâce au double critère largeur / remplissage de la bande au sol.</w:t>
+      </w:r>
+    </w:p>
+    <w:p>
+      <w:pPr>
+        <w:pStyle w:val="Heading2"/>
+        <w:spacing w:after="120"/>
+        <w:jc w:val="left"/>
+      </w:pPr>
+      <w:r/>
+      <w:r>
+        <w:rPr>
+          <w:rFonts w:ascii="Calibri" w:hAnsi="Calibri"/>
+          <w:sz w:val="22"/>
+        </w:rPr>
+        <w:t>Problème 3 — des transitions « se couche » / « se lève » en rafale</w:t>
+      </w:r>
+    </w:p>
+    <w:p>
+      <w:pPr>
+        <w:spacing w:after="120"/>
+        <w:jc w:val="left"/>
+      </w:pPr>
+      <w:r>
+        <w:rPr>
+          <w:rFonts w:ascii="Calibri" w:hAnsi="Calibri"/>
+          <w:sz w:val="22"/>
+        </w:rPr>
+        <w:t xml:space="preserve">Le verdict « couché » peut hésiter d'une image à l'autre quand la silhouette d'un animal se confond avec celle d'un voisin. Chaque hésitation redéclenchait la transition : une piste a affiché « se lève » pendant 136 images d'affilée. Un délai de réarmement de cinq secondes a été ajouté : une seule transition possible par fenêtre — un bovin ne se couche pas deux fois en cinq secondes. Les oscillations sont absorbées, les vraies transitions restent visibles.</w:t>
+      </w:r>
+    </w:p>
+    <w:p>
+      <w:pPr>
+        <w:pStyle w:val="Heading2"/>
+        <w:spacing w:after="120"/>
+        <w:jc w:val="left"/>
+      </w:pPr>
+      <w:r/>
+      <w:r>
+        <w:rPr>
+          <w:rFonts w:ascii="Calibri" w:hAnsi="Calibri"/>
+          <w:sz w:val="22"/>
+        </w:rPr>
+        <w:t>Corrections liées à l'angle de vue</w:t>
+      </w:r>
+    </w:p>
+    <w:p>
+      <w:pPr>
+        <w:spacing w:after="120"/>
+        <w:jc w:val="left"/>
+      </w:pPr>
+      <w:r>
+        <w:rPr>
+          <w:rFonts w:ascii="Calibri" w:hAnsi="Calibri"/>
+          <w:sz w:val="22"/>
+        </w:rPr>
+        <w:t xml:space="preserve">Trois erreurs venaient du même angle mort : les règles avaient été calibrées sur des vues de profil. Vu de face, la boîte d'un bovin est étroite — la largeur des épaules — et le simple balancement de tête d'une vache à l'auge suffisait à franchir le seuil de « marche » ; la vitesse est désormais rapportée à la plus grande dimension de la boîte, ce qui rend le seuil valable sous tous les angles. Une silhouette plus haute que large ne peut plus être déclarée « couché » : un bovin au sol est toujours plus large que haut, ce qui élimine les faux « couché » sur des animaux vus de face ou tête baissée. Enfin, les seuils du signal « mufle au sol » ont été resserrés — une ombre ou un sabot vu de biais ne déclenche plus « pâture » — et « boit » n'est retenu que tout en bas du cadre, là où se trouve réellement un abreuvoir au premier plan.</w:t>
+      </w:r>
+    </w:p>
+    <w:p>
+      <w:pPr>
+        <w:spacing w:after="120"/>
+        <w:jc w:val="center"/>
+      </w:pPr>
+      <w:r>
+        <w:drawing>
+          <wp:inline xmlns:a="http://schemas.openxmlformats.org/drawingml/2006/main" xmlns:pic="http://schemas.openxmlformats.org/drawingml/2006/picture">
+            <wp:extent cx="5669280" cy="3186480"/>
+            <wp:docPr id="113" name="capture_auge.jpg"/>
+            <wp:cNvGraphicFramePr>
+              <a:graphicFrameLocks noChangeAspect="1"/>
+            </wp:cNvGraphicFramePr>
+            <a:graphic>
+              <a:graphicData uri="http://schemas.openxmlformats.org/drawingml/2006/picture">
+                <pic:pic>
+                  <pic:nvPicPr>
+                    <pic:cNvPr id="0" name="capture_auge.jpg"/>
+                    <pic:cNvPicPr/>
+                  </pic:nvPicPr>
+                  <pic:blipFill>
+                    <a:blip r:embed="rIdImg13"/>
+                    <a:stretch>
+                      <a:fillRect/>
+                    </a:stretch>
+                  </pic:blipFill>
+                  <pic:spPr>
+                    <a:xfrm>
+                      <a:off x="0" y="0"/>
+                      <a:ext cx="5669280" cy="3186480"/>
+                    </a:xfrm>
+                    <a:prstGeom prst="rect"/>
+                  </pic:spPr>
+                </pic:pic>
+              </a:graphicData>
+            </a:graphic>
+          </wp:inline>
+        </w:drawing>
+      </w:r>
+    </w:p>
+    <w:p>
+      <w:pPr>
+        <w:spacing w:after="120"/>
+        <w:jc w:val="center"/>
+      </w:pPr>
+      <w:r/>
+      <w:r>
+        <w:rPr>
+          <w:rFonts w:ascii="Calibri" w:hAnsi="Calibri"/>
+          <w:i/>
+          <w:color w:val="606060"/>
+          <w:sz w:val="18"/>
+        </w:rPr>
+        <w:t xml:space="preserve">Figure 18 — Vaches à l'auge, vues de face. Après correction, elles sont étiquetées « immobile » et non plus « marche » : la vitesse est désormais rapportée à la plus grande dimension de la boîte, insensible au balancement de tête vu de face.</w:t>
+      </w:r>
+    </w:p>
+    <w:p>
+      <w:pPr>
+        <w:pStyle w:val="Heading2"/>
+        <w:spacing w:after="120"/>
+        <w:jc w:val="left"/>
+      </w:pPr>
+      <w:r/>
+      <w:r>
+        <w:rPr>
+          <w:rFonts w:ascii="Calibri" w:hAnsi="Calibri"/>
+          <w:sz w:val="22"/>
+        </w:rPr>
+        <w:t>Ce que cette étape confirme — et la suite</w:t>
+      </w:r>
+    </w:p>
+    <w:p>
+      <w:pPr>
+        <w:spacing w:after="120"/>
+        <w:jc w:val="left"/>
+      </w:pPr>
+      <w:r>
+        <w:rPr>
+          <w:rFonts w:ascii="Calibri" w:hAnsi="Calibri"/>
+          <w:sz w:val="22"/>
+        </w:rPr>
+        <w:t xml:space="preserve">Chaque correction a été validée en rejouant le pipeline complet sur les séquences de terrain, et la suite de 104 tests automatisés passe après chaque modification. Mais le constat de fond demeure : chaque nouvelle vidéo peut révéler un nouvel angle mort, et des règles géométriques ont un plafond. La prochaine étape est donc d'apprendre les postures à partir d'exemples plutôt que de les déduire par des règles : un jeu de données public de comportements bovins (CBVD-5) fournira les images, et un petit classifieur sera entraîné sur les empreintes déjà calculées par la ré-identification — un entraînement de quelques minutes sur la machine actuelle, sans annotation manuelle au départ. Les règles actuelles resteront en repli lorsque le classifieur doutera.</w:t>
+      </w:r>
+    </w:p>
+    <w:p>
+      <w:pPr>
+        <w:pStyle w:val="Heading1"/>
+        <w:spacing w:after="180" w:before="360"/>
+      </w:pPr>
+      <w:r>
+        <w:rPr>
+          <w:rFonts w:ascii="Calibri" w:cs="Calibri" w:eastAsia="Calibri" w:hAnsi="Calibri"/>
+          <w:b/>
+          <w:bCs/>
+          <w:color w:val="1F3864"/>
+          <w:sz w:val="32"/>
+          <w:szCs w:val="32"/>
+        </w:rPr>
+        <w:t>13. Tableau récapitulatif des décisions</w:t>
       </w:r>
     </w:p>
     <w:tbl>
@@ -9121,7 +9890,7 @@
           <w:sz w:val="32"/>
           <w:szCs w:val="32"/>
         </w:rPr>
-        <w:t xml:space="preserve">12. Limites connues et honnêteté scientifique</w:t>
+        <w:t>14. Limites connues et honnêteté scientifique</w:t>
       </w:r>
     </w:p>
     <w:p>
@@ -9634,7 +10403,7 @@
           <w:sz w:val="32"/>
           <w:szCs w:val="32"/>
         </w:rPr>
-        <w:t xml:space="preserve">13. Perspectives</w:t>
+        <w:t>15. Perspectives</w:t>
       </w:r>
     </w:p>
     <w:p>

</xml_diff>